<commit_message>
Update volume CDC format for schema consistency
</commit_message>
<xml_diff>
--- a/J8L Application Guide for EVT2.docx
+++ b/J8L Application Guide for EVT2.docx
@@ -110,8 +110,6 @@
         </w:rPr>
         <w:t xml:space="preserve"> Application Guide</w:t>
       </w:r>
-      <w:bookmarkStart w:id="0" w:name="_GoBack"/>
-      <w:bookmarkEnd w:id="0"/>
     </w:p>
     <w:p>
       <w:pPr>
@@ -149,7 +147,7 @@
           <w:sz w:val="48"/>
           <w:szCs w:val="48"/>
         </w:rPr>
-        <w:t>.0</w:t>
+        <w:t>.1</w:t>
       </w:r>
       <w:r>
         <w:rPr>
@@ -203,7 +201,7 @@
           <w:sz w:val="48"/>
           <w:szCs w:val="48"/>
         </w:rPr>
-        <w:t>7</w:t>
+        <w:t>8</w:t>
       </w:r>
     </w:p>
     <w:p>
@@ -233,7 +231,7 @@
           <w:sz w:val="36"/>
           <w:szCs w:val="36"/>
         </w:rPr>
-        <w:t>24</w:t>
+        <w:t>27</w:t>
       </w:r>
       <w:r>
         <w:rPr>
@@ -6533,7 +6531,16 @@
           <w:rFonts w:ascii="Arial" w:eastAsia="微軟正黑體" w:hAnsi="Arial" w:cs="Arial"/>
           <w:szCs w:val="16"/>
         </w:rPr>
-        <w:t>Note 1: If the message returns "NG", an error code will follow: 0 = Invalid Command, 1 = Invalid Parameter, 2 = I/O Error, 3 = Command Not Allowed (Incorrect System State)</w:t>
+        <w:t xml:space="preserve">Note 1: If the message returns "NG", an error code will follow: 0 = Invalid Command, 1 = Invalid </w:t>
+      </w:r>
+      <w:bookmarkStart w:id="0" w:name="_GoBack"/>
+      <w:bookmarkEnd w:id="0"/>
+      <w:r>
+        <w:rPr>
+          <w:rFonts w:ascii="Arial" w:eastAsia="微軟正黑體" w:hAnsi="Arial" w:cs="Arial"/>
+          <w:szCs w:val="16"/>
+        </w:rPr>
+        <w:t>Parameter, 2 = I/O Error, 3 = Command Not Allowed (Incorrect System State)</w:t>
       </w:r>
     </w:p>
     <w:p>
@@ -7014,7 +7021,34 @@
                 <w:kern w:val="0"/>
                 <w:szCs w:val="16"/>
               </w:rPr>
-              <w:t>+/-</w:t>
+              <w:t>+</w:t>
+            </w:r>
+            <w:r>
+              <w:rPr>
+                <w:rFonts w:ascii="Arial" w:eastAsia="微軟正黑體" w:hAnsi="Arial" w:cs="Arial"/>
+                <w:color w:val="000000"/>
+                <w:kern w:val="0"/>
+                <w:szCs w:val="16"/>
+              </w:rPr>
+              <w:t>1</w:t>
+            </w:r>
+            <w:r>
+              <w:rPr>
+                <w:rFonts w:ascii="Arial" w:eastAsia="微軟正黑體" w:hAnsi="Arial" w:cs="Arial"/>
+                <w:color w:val="000000"/>
+                <w:kern w:val="0"/>
+                <w:szCs w:val="16"/>
+              </w:rPr>
+              <w:t>/-</w:t>
+            </w:r>
+            <w:r>
+              <w:rPr>
+                <w:rFonts w:ascii="Arial" w:eastAsia="微軟正黑體" w:hAnsi="Arial" w:cs="Arial"/>
+                <w:color w:val="000000"/>
+                <w:kern w:val="0"/>
+                <w:szCs w:val="16"/>
+              </w:rPr>
+              <w:t>1</w:t>
             </w:r>
             <w:r>
               <w:rPr>
@@ -7102,6 +7136,15 @@
                 <w:szCs w:val="16"/>
               </w:rPr>
               <w:t>+</w:t>
+            </w:r>
+            <w:r>
+              <w:rPr>
+                <w:rFonts w:ascii="Arial" w:eastAsia="微軟正黑體" w:hAnsi="Arial" w:cs="Arial"/>
+                <w:color w:val="000000"/>
+                <w:kern w:val="0"/>
+                <w:szCs w:val="16"/>
+              </w:rPr>
+              <w:t>1</w:t>
             </w:r>
             <w:r>
               <w:rPr>
@@ -7712,7 +7755,7 @@
             <v:path o:extrusionok="f" gradientshapeok="t" o:connecttype="rect"/>
             <o:lock v:ext="edit" aspectratio="t"/>
           </v:shapetype>
-          <v:shape id="_x0000_i1025" type="#_x0000_t75" style="width:522.25pt;height:350.35pt">
+          <v:shape id="_x0000_i1025" type="#_x0000_t75" style="width:521.65pt;height:350.5pt">
             <v:imagedata r:id="rId11" o:title="a"/>
           </v:shape>
         </w:pict>
@@ -34645,6 +34688,7 @@
     <w:rsid w:val="00045EB8"/>
     <w:rsid w:val="000A1052"/>
     <w:rsid w:val="00162F3D"/>
+    <w:rsid w:val="001A2AFC"/>
     <w:rsid w:val="001F59A5"/>
     <w:rsid w:val="002064BB"/>
     <w:rsid w:val="00286527"/>
@@ -35355,15 +35399,6 @@
 </file>
 
 <file path=customXml/item2.xml><?xml version="1.0" encoding="utf-8"?>
-<p:properties xmlns:p="http://schemas.microsoft.com/office/2006/metadata/properties" xmlns:xsi="http://www.w3.org/2001/XMLSchema-instance" xmlns:pc="http://schemas.microsoft.com/office/infopath/2007/PartnerControls">
-  <documentManagement>
-    <Status xmlns="71af3243-3dd4-4a8d-8c0d-dd76da1f02a5">Not started</Status>
-    <MediaServiceKeyPoints xmlns="71af3243-3dd4-4a8d-8c0d-dd76da1f02a5" xsi:nil="true"/>
-  </documentManagement>
-</p:properties>
-</file>
-
-<file path=customXml/item3.xml><?xml version="1.0" encoding="utf-8"?>
 <ct:contentTypeSchema xmlns:ct="http://schemas.microsoft.com/office/2006/metadata/contentType" xmlns:ma="http://schemas.microsoft.com/office/2006/metadata/properties/metaAttributes" ct:_="" ma:_="" ma:contentTypeName="Document" ma:contentTypeID="0x01010079F111ED35F8CC479449609E8A0923A6" ma:contentTypeVersion="12" ma:contentTypeDescription="Create a new document." ma:contentTypeScope="" ma:versionID="a8a52e8c320b9a064ae3583ae3861c92">
   <xsd:schema xmlns:xsd="http://www.w3.org/2001/XMLSchema" xmlns:xs="http://www.w3.org/2001/XMLSchema" xmlns:p="http://schemas.microsoft.com/office/2006/metadata/properties" xmlns:ns2="71af3243-3dd4-4a8d-8c0d-dd76da1f02a5" xmlns:ns3="16c05727-aa75-4e4a-9b5f-8a80a1165891" targetNamespace="http://schemas.microsoft.com/office/2006/metadata/properties" ma:root="true" ma:fieldsID="88020cb39231a0945110f9cd888b521a" ns2:_="" ns3:_="">
     <xsd:import namespace="71af3243-3dd4-4a8d-8c0d-dd76da1f02a5"/>
@@ -35584,6 +35619,15 @@
 </ct:contentTypeSchema>
 </file>
 
+<file path=customXml/item3.xml><?xml version="1.0" encoding="utf-8"?>
+<p:properties xmlns:p="http://schemas.microsoft.com/office/2006/metadata/properties" xmlns:xsi="http://www.w3.org/2001/XMLSchema-instance" xmlns:pc="http://schemas.microsoft.com/office/infopath/2007/PartnerControls">
+  <documentManagement>
+    <Status xmlns="71af3243-3dd4-4a8d-8c0d-dd76da1f02a5">Not started</Status>
+    <MediaServiceKeyPoints xmlns="71af3243-3dd4-4a8d-8c0d-dd76da1f02a5" xsi:nil="true"/>
+  </documentManagement>
+</p:properties>
+</file>
+
 <file path=customXml/item4.xml><?xml version="1.0" encoding="utf-8"?>
 <?mso-contentType ?>
 <FormTemplates xmlns="http://schemas.microsoft.com/sharepoint/v3/contenttype/forms">
@@ -35602,16 +35646,6 @@
 </file>
 
 <file path=customXml/itemProps2.xml><?xml version="1.0" encoding="utf-8"?>
-<ds:datastoreItem xmlns:ds="http://schemas.openxmlformats.org/officeDocument/2006/customXml" ds:itemID="{351C23AB-CFBF-417A-B773-C0D8D95A840F}">
-  <ds:schemaRefs>
-    <ds:schemaRef ds:uri="http://schemas.microsoft.com/office/2006/metadata/properties"/>
-    <ds:schemaRef ds:uri="http://schemas.microsoft.com/office/infopath/2007/PartnerControls"/>
-    <ds:schemaRef ds:uri="71af3243-3dd4-4a8d-8c0d-dd76da1f02a5"/>
-  </ds:schemaRefs>
-</ds:datastoreItem>
-</file>
-
-<file path=customXml/itemProps3.xml><?xml version="1.0" encoding="utf-8"?>
 <ds:datastoreItem xmlns:ds="http://schemas.openxmlformats.org/officeDocument/2006/customXml" ds:itemID="{F4859B9C-6203-4B82-8AB2-6504B135F3AC}">
   <ds:schemaRefs>
     <ds:schemaRef ds:uri="http://schemas.microsoft.com/office/2006/metadata/contentType"/>
@@ -35630,6 +35664,16 @@
 </ds:datastoreItem>
 </file>
 
+<file path=customXml/itemProps3.xml><?xml version="1.0" encoding="utf-8"?>
+<ds:datastoreItem xmlns:ds="http://schemas.openxmlformats.org/officeDocument/2006/customXml" ds:itemID="{351C23AB-CFBF-417A-B773-C0D8D95A840F}">
+  <ds:schemaRefs>
+    <ds:schemaRef ds:uri="http://schemas.microsoft.com/office/2006/metadata/properties"/>
+    <ds:schemaRef ds:uri="http://schemas.microsoft.com/office/infopath/2007/PartnerControls"/>
+    <ds:schemaRef ds:uri="71af3243-3dd4-4a8d-8c0d-dd76da1f02a5"/>
+  </ds:schemaRefs>
+</ds:datastoreItem>
+</file>
+
 <file path=customXml/itemProps4.xml><?xml version="1.0" encoding="utf-8"?>
 <ds:datastoreItem xmlns:ds="http://schemas.openxmlformats.org/officeDocument/2006/customXml" ds:itemID="{C4ED7208-DCDA-47E6-88E1-54D56125A564}">
   <ds:schemaRefs>

</xml_diff>